<commit_message>
Incorporated edits from Susanne's review
</commit_message>
<xml_diff>
--- a/EBS_GroundfishCondition_2025.docx
+++ b/EBS_GroundfishCondition_2025.docx
@@ -461,7 +461,7 @@
         <w:t xml:space="preserve"> </w:t>
       </w:r>
       <w:r>
-        <w:t xml:space="preserve">Fish condition, measured by length-weight residuals, has varied over time for all species examined in the EBS (Figures 2 &amp; 3). An increase in condition was observed across all species in the EBS (large walleye pollock (&gt;250 mm), small walleye pollock (100-250 mm), Pacific cod, northern rock sole, yellowfin sole, arrowtooth flounder, Alaska plaice, and flathead sole). The increase in condition from the previous year was approximately one standard deviation or greater for every species except for large walleye pollock (&gt;250 mm) and small walleye pollock (100-250 mm). In 2025, mean condition for all species except small walleye pollock (100-250 mm) was at or above the time series mean. The mean condition of small walleye pollock (100-250 mm) was negative in 2025 and marginally increased compared to 2024; however, it remained just below one standard deviation of the historical mean. In 2025, Pacific cod condition reached its highest level since 2005, yellowfin sole condition was the highest observed in the time series, and arrowtooth flounder condition was the second highest in the time series, behind 2019.</w:t>
+        <w:t xml:space="preserve">Fish condition, measured by length-weight residuals, has varied over time for all species examined in the EBS (Figures 2 &amp; 3). An increase in condition was observed across all species in the EBS (large walleye pollock (&gt;250 mm), small walleye pollock (100-250 mm), Pacific cod, northern rock sole, yellowfin sole, arrowtooth flounder, Alaska plaice, and flathead sole). The increase in condition from the previous year was approximately one standard deviation or greater for every species except for large walleye pollock (&gt;250 mm) and small walleye pollock (100-250 mm). In 2025, mean condition for all species except small walleye pollock (100-250 mm) was at or above the time series mean. The mean condition of small walleye pollock (100-250 mm) marginally increased compared to 2024; however, it remained just below one standard deviation of the historical mean. Other species showed a marked increase in fish condition in 2025: Pacific cod condition reached its highest level since 2005, yellowfin sole condition was the highest observed in the time series, and arrowtooth flounder condition was the second highest in the time series, behind 2019.</w:t>
       </w:r>
     </w:p>
     <w:p>
@@ -469,7 +469,7 @@
         <w:pStyle w:val="BodyText"/>
       </w:pPr>
       <w:r>
-        <w:t xml:space="preserve">In 2025, condition was positive across all strata for most species , with three exceptions: (1) small walleye pollock (100-250 mm) in all strata, (2) large walleye pollock (&gt;250 mm) in all strata except the southern middle shelf (Stratum 30), and (3) northern rock sole in the inner and middle shelf (Strata 10, 20 and 30; Figure 3).</w:t>
+        <w:t xml:space="preserve">In 2025, condition was positive across all strata for most species, with three exceptions: (1) small walleye pollock (100-250 mm) in all strata, (2) large walleye pollock (&gt;250 mm) in all strata except the southern middle shelf (Stratum 30), and (3) northern rock sole in the inner and middle shelf (Strata 10, 20 and 30; Figure 3).</w:t>
       </w:r>
     </w:p>
     <w:p>
@@ -597,7 +597,7 @@
         <w:t xml:space="preserve"> </w:t>
       </w:r>
       <w:r>
-        <w:t xml:space="preserve">In the NBS in 2025, positive condition was observed for large walleye pollock (&gt;250 mm), continuing an upward trend observed since 2021. Pacific cod and Alaska plaice exhibited near-average condition in the NBS in 2025, similar to values observed in 2023. Small walleye pollock (100-250 mm) were in below average condition which continued a downward trend since 2021. Yellowfin sole increased slightly from below average condition in 2023 to near-average in 2025 (Figure 4).</w:t>
+        <w:t xml:space="preserve">In the NBS in 2025, positive condition was observed for large walleye pollock (&gt;250 mm), continuing an upward trend observed since 2021. Pacific cod and Alaska plaice exhibited near-average condition, similar to values observed in 2023. Small walleye pollock (100-250 mm) were in below average condition which continued a downward trend since 2021. Yellowfin sole increased slightly from below average condition in 2023 to near-average in 2025 (Figure 4).</w:t>
       </w:r>
     </w:p>
     <w:p>
@@ -605,7 +605,7 @@
         <w:pStyle w:val="BodyText"/>
       </w:pPr>
       <w:r>
-        <w:t xml:space="preserve">In 2025, large walleye pollock (&gt;250 mm) exhibited positive condition across all NBS strata. In contrast, small walleye pollock (100-250 mm) and yellowfin sole were in negative condition in all NBS strata in both 2025 and 2023. Pacific cod condition in 2025 was negative on the outer and inner southern NBS shelf (Strata 71 and 81) but positive on the northern inner NBS shelf and Norton Sound (Stratum 70). Alaska plaice condition in 2025 was positive on the inner southern NBS shelf (Stratum 71) and negative in the other two strata (Strata 70 and 81; Figure 5).</w:t>
+        <w:t xml:space="preserve">In 2025, large walleye pollock (&gt;250 mm) exhibited positive condition across all NBS strata. In contrast, small walleye pollock (100-250 mm) and yellowfin sole were in negative condition in all NBS strata in both 2025 and 2023. Pacific cod condition was negative on the outer and inner southern NBS shelf (Strata 71 and 81) but positive on the northern inner NBS shelf and Norton Sound (Stratum 70). Alaska plaice condition was positive on the inner southern NBS shelf (Stratum 71) and negative in the other two strata (Strata 70 and 81; Figure 5).</w:t>
       </w:r>
     </w:p>
     <w:p>
@@ -730,7 +730,7 @@
         <w:t xml:space="preserve">Factors influencing observed trends</w:t>
       </w:r>
       <w:r>
-        <w:t xml:space="preserve">: The warming trend observed since 2023 may have influenced the morphological condition of species in the EBS. Near-average cold pool extent and water temperatures in 2024 were associated with near-average condition (within 1 S.D. of the mean) for all species examined in the EBS that year, while the further warming in 2025 were associated with subsequent increases in fish condition. In the EBS, particularly cold years have historically corresponded with negative condition, while warm years have generally corresponded with positive condition. For example, water temperatures were particularly cold during the 1999 eastern Bering Sea survey, when negative condition was observed for all species sampled. Spatiotemporal factor analyses also suggest the morphometric condition of age-7 walleye pollock is strongly correlated with cold pool extent in the EBS</w:t>
+        <w:t xml:space="preserve">: The warming trend observed since 2023 may have influenced the morphological condition of species in the EBS. Near-average cold pool extent and water temperatures in 2024 were associated with near-average condition (within 1 S.D. of the mean) for all species examined in the EBS that year, while the further warming in 2025 was associated with subsequent increases in fish condition. In the EBS, particularly cold years have historically corresponded with negative condition, while warm years have generally corresponded with positive condition. For example, water temperatures were particularly cold during the 1999 eastern Bering Sea survey, when negative condition was observed for all species sampled. Spatiotemporal factor analyses also suggest the morphometric condition of age-7 walleye pollock is strongly correlated with cold pool extent in the EBS</w:t>
       </w:r>
       <w:r>
         <w:t xml:space="preserve"> </w:t>
@@ -765,7 +765,7 @@
         <w:pStyle w:val="BodyText"/>
       </w:pPr>
       <w:r>
-        <w:t xml:space="preserve">Although warmer temperatures may increase growth rates if there is adequate prey to offset temperature-dependent increases in metabolic demand, growth rates may also decline if prey resources are insufficient to offset temperature-dependent increases in metabolic demand. The influence of temperature on growth rates depends on the physiology of predator species, prey availability, and the adaptive capacity of predators to respond to environmental change through migration, changes in behavior, and acclimatization. For example, elevated temperatures during the 2014–2016 marine heatwave in the Gulf of Alaska led to lower growth rates and condition of Pacific cod and early life history stages of walleye pollock, because available prey resources did not make up for increased metabolic demand</w:t>
+        <w:t xml:space="preserve">Although warmer temperatures may increase growth rates if there is adequate prey to offset temperature-dependent increases in metabolic demand, growth rates may also decline if prey resources are insufficient to offset temperature-dependent increases in metabolic demand. Therefore, the influence of temperature on growth rates depends on the physiology of predator species, prey availability, and the adaptive capacity of predators to respond to environmental change through migration, changes in behavior, and acclimatization. For example, elevated temperatures during the 2014–2016 marine heatwave in the Gulf of Alaska led to lower growth rates and condition of Pacific cod and early life history stages of walleye pollock, because available prey resources did not make up for increased metabolic demand</w:t>
       </w:r>
       <w:r>
         <w:t xml:space="preserve"> </w:t>
@@ -800,7 +800,7 @@
         <w:t xml:space="preserve">(Wuenschel et al., 2019)</w:t>
       </w:r>
       <w:r>
-        <w:t xml:space="preserve">. In addition, because weights are taken at sea and include gut content, variation in stomach fullness may influence condition estimates. Since feeding conditions vary over space and time, prey consumption rates and the proportion of total body weight attributable to gut contents may be an important factor influencing the length-weight residuals.</w:t>
+        <w:t xml:space="preserve">. In addition, because weights are taken at sea and include gut contents, variation in stomach fullness may influence condition estimates. Since feeding conditions vary over space and time, prey consumption rates and the proportion of total body weight attributable to gut contents may be an important factor influencing the length-weight residuals.</w:t>
       </w:r>
     </w:p>
     <w:p>
@@ -868,7 +868,7 @@
         <w:t xml:space="preserve">(Haberle et al., 2023)</w:t>
       </w:r>
       <w:r>
-        <w:t xml:space="preserve">. Thus, the condition of EBS and NBS groundfishes may provide insight into ecosystem productivity as well as fish survival, demographic status, and population health. However, survivorship is likely affected by many factors not examined here.</w:t>
+        <w:t xml:space="preserve">. Thus, the condition of EBS and NBS groundfishes may provide insight into ecosystem productivity as well as fish survival, demographic status, and population health. However, survivorship is likely also affected by many factors not examined here.</w:t>
       </w:r>
     </w:p>
     <w:p>
@@ -876,7 +876,7 @@
         <w:pStyle w:val="BodyText"/>
       </w:pPr>
       <w:r>
-        <w:t xml:space="preserve">Another important consideration is that fish condition was computed for all sizes of fishes combined, except in the case of walleye pollock. Examining condition of early juvenile stage fishes not yet recruited to the fishery, or the condition of adult fishes separately, could provide greater insight into the value of length-weight residuals as an indicator of individual health or survivorship</w:t>
+        <w:t xml:space="preserve">Another important consideration is that fish condition was computed for all sizes of fishes combined, except in the case of walleye pollock. Examining condition of early juvenile stage fishes seperately from the condition of adult fishes could provide further insight into the value of length-weight residuals as an indicator of individual health or survivorship</w:t>
       </w:r>
       <w:r>
         <w:t xml:space="preserve"> </w:t>

</xml_diff>